<commit_message>
Chinh sua ky thuat dong bo quota kWh va sa thai tai co dieu kien cuoi cung
</commit_message>
<xml_diff>
--- a/Kế_Hoạch_Kiểm_Thử_Luận_Văn.docx
+++ b/Kế_Hoạch_Kiểm_Thử_Luận_Văn.docx
@@ -209,7 +209,7 @@
           <w:sz w:val="24"/>
           <w:rFonts w:ascii="Times New Roman" w:hAnsi="Times New Roman" w:cs="Times New Roman"/>
         </w:rPr>
-        <w:t xml:space="preserve"> Thực nghiệm thuật toán sa thải phụ tải chủ động (Active Load-shedding) theo thứ tự ưu tiên khi hệ thống tiệm cận hoặc tiệm cận hoặc vượt mức giới hạn (Quota) điện năng tháng (kWh).</w:t>
+        <w:t xml:space="preserve"> Thực nghiệm thuật toán sa thải phụ tải phi thiết yếu có điều kiện theo thứ tự ưu tiên khi hệ thống tiệm cận hoặc vượt hạn mức điện năng tháng kWh mức giới hạn (Quota) điện năng tháng (kWh).</w:t>
       </w:r>
     </w:p>
     <w:p>
@@ -2835,7 +2835,7 @@
           <w:sz w:val="24"/>
           <w:rFonts w:ascii="Times New Roman" w:hAnsi="Times New Roman" w:cs="Times New Roman"/>
         </w:rPr>
-        <w:t>Hệ thống thiết lập thứ tự ưu tiên của 3 phòng tải giả định để thực hiện thuật toán sa thải phụ tải chủ động (Active Load-shedding):</w:t>
+        <w:t>Hệ thống thiết lập thứ tự ưu tiên của 3 phòng tải giả định để thực hiện thuật toán sa thải phụ tải phi thiết yếu có điều kiện:</w:t>
       </w:r>
     </w:p>
     <w:p>

</xml_diff>